<commit_message>
Guard extension updates and show matching build identities
</commit_message>
<xml_diff>
--- a/docs/dev/getting-started.docx
+++ b/docs/dev/getting-started.docx
@@ -2603,7 +2603,16 @@
         <w:spacing w:after="120"/>
       </w:pPr>
       <w:r>
-        <w:t xml:space="preserve">Open the package to install the apps into </w:t>
+        <w:t xml:space="preserve">Quit Mail, Mail-Filter and its uninstaller </w:t>
+      </w:r>
+      <w:r>
+        <w:rPr>
+          <w:b/>
+        </w:rPr>
+        <w:t xml:space="preserve">before</w:t>
+      </w:r>
+      <w:r>
+        <w:t xml:space="preserve"> opening the package to install into </w:t>
       </w:r>
       <w:r>
         <w:rPr>
@@ -2614,7 +2623,7 @@
         <w:t xml:space="preserve">/Applications</w:t>
       </w:r>
       <w:r>
-        <w:t xml:space="preserve">. Compatible private settings, activity and protection survive updates. The optional </w:t>
+        <w:t xml:space="preserve">. Installer uses a native close-app requirement, plus a read-only preinstall check across users. It stops before replacement if an old extension process remains or process inspection fails. If Mail has quit but the extension does not exit, restart the Mac before retrying. The guard never terminates apps or changes private settings. Compatible private settings, activity and protection survive updates. The optional </w:t>
       </w:r>
       <w:r>
         <w:rPr>
@@ -2642,7 +2651,16 @@
         <w:spacing w:after="120"/>
       </w:pPr>
       <w:r>
-        <w:t xml:space="preserve">Quit and reopen Mail-Filter and Mail after replacing the installed app. Confirm host and installed extension builds in the diagnostic report, check the extension in Mail Settings, and confirm saved account selection, </w:t>
+        <w:t xml:space="preserve">After installation, open Mail-Filter and reopen Mail. Compare the sidebar build with </w:t>
+      </w:r>
+      <w:r>
+        <w:rPr>
+          <w:b/>
+        </w:rPr>
+        <w:t xml:space="preserve">Mail-Filter (build 21)</w:t>
+      </w:r>
+      <w:r>
+        <w:t xml:space="preserve"> in Mail Settings, using the current build number. Confirm saved accounts, </w:t>
       </w:r>
       <w:r>
         <w:rPr>
@@ -2651,7 +2669,7 @@
         <w:t xml:space="preserve">Enable filtering</w:t>
       </w:r>
       <w:r>
-        <w:t xml:space="preserve">, Preview and model readiness. Keeping an old process alive can mask a successful rebuild. The settings window can then close; Mail must stay running.</w:t>
+        <w:t xml:space="preserve">, Preview and model readiness. Activity retains the last extension startup build and time; application diagnostics also record its process ID. This is historical evidence, not a liveness check, and earlier builds have no startup identity. Verify a new incoming callback after the update; old Inbox messages are not replayed. The settings window can then close; Mail must stay running.</w:t>
       </w:r>
     </w:p>
     <w:p>

</xml_diff>

<commit_message>
Record build 27 submission and update release guidance
</commit_message>
<xml_diff>
--- a/docs/dev/getting-started.docx
+++ b/docs/dev/getting-started.docx
@@ -2720,7 +2720,7 @@
         </w:r>
       </w:hyperlink>
       <w:r>
-        <w:t xml:space="preserve"> before changing retry budgets. Smaller sections reduce individual request size while potentially increasing total attempt time. Queue admission begins the 60-second budget; earlier waiting time is separate. The SDK gate is process-local, and a never-returning framework call cannot be forcefully retired through this code. Store review remains on hold.</w:t>
+        <w:t xml:space="preserve"> before changing retry budgets. Smaller sections reduce individual request size while potentially increasing total attempt time. Queue admission begins the 60-second budget; earlier waiting time is separate. The SDK gate is process-local, and a never-returning framework call cannot be forcefully retired through this code. See current release status.</w:t>
       </w:r>
     </w:p>
     <w:p>
@@ -2958,15 +2958,15 @@
         <w:t xml:space="preserve">~/Desktop/Mail-Filter Request Budget Comparison.json</w:t>
       </w:r>
       <w:r>
-        <w:t xml:space="preserve">. Real-email comparisons contain private message/model text; keep them outside Git. Share the explicit report together with the normal support report when investigating a failure. Build 24 production uses the 3,000-character/256-token combination, with retries at 1,500 characters and unchanged 20/60-second deadlines; this command changes no filtering settings or mailbox contents. The local synthetic matrix does not reproduce or prove resolution of the original failure. Keep review on hold until a plausible matching failure has been reproduced and the mitigation demonstrated. Keep debugging on the publisher’s Mac using the local reproduction plan. The remote family member is only a beta tester; neither extra passing controls nor a different hardware specification establishes the original failure’s cause.</w:t>
-      </w:r>
-    </w:p>
-    <w:p>
-      <w:pPr>
-        <w:spacing w:after="120"/>
-      </w:pPr>
-      <w:r>
-        <w:t xml:space="preserve">The stress probe compares the exact previous standard policy with the candidate policy, captures response scalars and evaluates the approved build's parser. The output-limit probe intentionally uses tiny response limits as a truncation control; failure at one or two tokens is not evidence that the shipped 64-token budget caused a failure. Reports are private Desktop files and must not become committed email fixtures. The 48 local stress trials passed without reproducing the affected Mac's first-attempt failure. Review remains on hold until a plausible matching scenario is recreated and a mitigation is demonstrated; passing injected faults alone does not satisfy that gate.</w:t>
+        <w:t xml:space="preserve">. Real-email comparisons contain private message/model text; keep them outside Git. Share the explicit report together with the normal support report when investigating a failure. Build 24 production uses the 3,000-character/256-token combination, with retries at 1,500 characters and unchanged 20/60-second deadlines; this command changes no filtering settings or mailbox contents. The local synthetic matrix does not reproduce or prove resolution of the original failure. Record remaining reproduction limits and obtain publisher approval before submitting an update. Keep debugging on the publisher’s Mac using the local reproduction plan. The remote family member is only a beta tester; neither extra passing controls nor a different hardware specification establishes the original failure’s cause.</w:t>
+      </w:r>
+    </w:p>
+    <w:p>
+      <w:pPr>
+        <w:spacing w:after="120"/>
+      </w:pPr>
+      <w:r>
+        <w:t xml:space="preserve">The stress probe compares the exact previous standard policy with the candidate policy, captures response scalars and evaluates the approved build's parser. The output-limit probe intentionally uses tiny response limits as a truncation control; failure at one or two tokens is not evidence that the shipped 64-token budget caused a failure. Reports are private Desktop files and must not become committed email fixtures. The 48 local stress trials passed without reproducing the affected Mac's first-attempt failure. These trials do not recreate the original failure. The publisher approved build 27 after the defensive audit and clean-build qualification; see the release record.</w:t>
       </w:r>
     </w:p>
     <w:p>

</xml_diff>